<commit_message>
afegim les noves modalitats de la DGT https://jira.aoc.cat/browse/ST-28599
</commit_message>
<xml_diff>
--- a/Documents/Àmbit Administració General de l'Estat(AGE)/D-DGT/Document homologació Registre de vehicles i conductors_v1.0.docx
+++ b/Documents/Àmbit Administració General de l'Estat(AGE)/D-DGT/Document homologació Registre de vehicles i conductors_v1.0.docx
@@ -1,6 +1,6 @@
 
 <file path=word/document.xml><?xml version="1.0" encoding="utf-8"?>
-<w:document xmlns:wpc="http://schemas.microsoft.com/office/word/2010/wordprocessingCanvas" xmlns:cx="http://schemas.microsoft.com/office/drawing/2014/chartex" xmlns:cx1="http://schemas.microsoft.com/office/drawing/2015/9/8/chartex" xmlns:cx2="http://schemas.microsoft.com/office/drawing/2015/10/21/chartex" xmlns:cx3="http://schemas.microsoft.com/office/drawing/2016/5/9/chartex" xmlns:cx4="http://schemas.microsoft.com/office/drawing/2016/5/10/chartex" xmlns:cx5="http://schemas.microsoft.com/office/drawing/2016/5/11/chartex" xmlns:cx6="http://schemas.microsoft.com/office/drawing/2016/5/12/chartex" xmlns:cx7="http://schemas.microsoft.com/office/drawing/2016/5/13/chartex" xmlns:cx8="http://schemas.microsoft.com/office/drawing/2016/5/14/chartex" xmlns:mc="http://schemas.openxmlformats.org/markup-compatibility/2006" xmlns:aink="http://schemas.microsoft.com/office/drawing/2016/ink" xmlns:am3d="http://schemas.microsoft.com/office/drawing/2017/model3d" xmlns:o="urn:schemas-microsoft-com:office:office" xmlns:oel="http://schemas.microsoft.com/office/2019/extlst" xmlns:r="http://schemas.openxmlformats.org/officeDocument/2006/relationships" xmlns:m="http://schemas.openxmlformats.org/officeDocument/2006/math" xmlns:v="urn:schemas-microsoft-com:vml" xmlns:wp14="http://schemas.microsoft.com/office/word/2010/wordprocessingDrawing" xmlns:wp="http://schemas.openxmlformats.org/drawingml/2006/wordprocessingDrawing" xmlns:w10="urn:schemas-microsoft-com:office:word" xmlns:w="http://schemas.openxmlformats.org/wordprocessingml/2006/main" xmlns:w14="http://schemas.microsoft.com/office/word/2010/wordml" xmlns:w15="http://schemas.microsoft.com/office/word/2012/wordml" xmlns:w16cex="http://schemas.microsoft.com/office/word/2018/wordml/cex" xmlns:w16cid="http://schemas.microsoft.com/office/word/2016/wordml/cid" xmlns:w16="http://schemas.microsoft.com/office/word/2018/wordml" xmlns:w16sdtdh="http://schemas.microsoft.com/office/word/2020/wordml/sdtdatahash" xmlns:w16se="http://schemas.microsoft.com/office/word/2015/wordml/symex" xmlns:wpg="http://schemas.microsoft.com/office/word/2010/wordprocessingGroup" xmlns:wpi="http://schemas.microsoft.com/office/word/2010/wordprocessingInk" xmlns:wne="http://schemas.microsoft.com/office/word/2006/wordml" xmlns:wps="http://schemas.microsoft.com/office/word/2010/wordprocessingShape" mc:Ignorable="w14 w15 w16se w16cid w16 w16cex w16sdtdh wp14">
+<w:document xmlns:wpc="http://schemas.microsoft.com/office/word/2010/wordprocessingCanvas" xmlns:cx="http://schemas.microsoft.com/office/drawing/2014/chartex" xmlns:cx1="http://schemas.microsoft.com/office/drawing/2015/9/8/chartex" xmlns:cx2="http://schemas.microsoft.com/office/drawing/2015/10/21/chartex" xmlns:cx3="http://schemas.microsoft.com/office/drawing/2016/5/9/chartex" xmlns:cx4="http://schemas.microsoft.com/office/drawing/2016/5/10/chartex" xmlns:cx5="http://schemas.microsoft.com/office/drawing/2016/5/11/chartex" xmlns:cx6="http://schemas.microsoft.com/office/drawing/2016/5/12/chartex" xmlns:cx7="http://schemas.microsoft.com/office/drawing/2016/5/13/chartex" xmlns:cx8="http://schemas.microsoft.com/office/drawing/2016/5/14/chartex" xmlns:mc="http://schemas.openxmlformats.org/markup-compatibility/2006" xmlns:aink="http://schemas.microsoft.com/office/drawing/2016/ink" xmlns:am3d="http://schemas.microsoft.com/office/drawing/2017/model3d" xmlns:o="urn:schemas-microsoft-com:office:office" xmlns:oel="http://schemas.microsoft.com/office/2019/extlst" xmlns:r="http://schemas.openxmlformats.org/officeDocument/2006/relationships" xmlns:m="http://schemas.openxmlformats.org/officeDocument/2006/math" xmlns:v="urn:schemas-microsoft-com:vml" xmlns:wp14="http://schemas.microsoft.com/office/word/2010/wordprocessingDrawing" xmlns:wp="http://schemas.openxmlformats.org/drawingml/2006/wordprocessingDrawing" xmlns:w10="urn:schemas-microsoft-com:office:word" xmlns:w="http://schemas.openxmlformats.org/wordprocessingml/2006/main" xmlns:w14="http://schemas.microsoft.com/office/word/2010/wordml" xmlns:w15="http://schemas.microsoft.com/office/word/2012/wordml" xmlns:w16cex="http://schemas.microsoft.com/office/word/2018/wordml/cex" xmlns:w16cid="http://schemas.microsoft.com/office/word/2016/wordml/cid" xmlns:w16="http://schemas.microsoft.com/office/word/2018/wordml" xmlns:w16du="http://schemas.microsoft.com/office/word/2023/wordml/word16du" xmlns:w16sdtdh="http://schemas.microsoft.com/office/word/2020/wordml/sdtdatahash" xmlns:w16sdtfl="http://schemas.microsoft.com/office/word/2024/wordml/sdtformatlock" xmlns:w16se="http://schemas.microsoft.com/office/word/2015/wordml/symex" xmlns:wpg="http://schemas.microsoft.com/office/word/2010/wordprocessingGroup" xmlns:wpi="http://schemas.microsoft.com/office/word/2010/wordprocessingInk" xmlns:wne="http://schemas.microsoft.com/office/word/2006/wordml" xmlns:wps="http://schemas.microsoft.com/office/word/2010/wordprocessingShape" mc:Ignorable="w14 w15 w16se w16cid w16 w16cex w16sdtdh w16sdtfl w16du wp14">
   <w:body>
     <w:p>
       <w:pPr>
@@ -60,11 +60,11 @@
         <w:tblLook w:val="04A0" w:firstRow="1" w:lastRow="0" w:firstColumn="1" w:lastColumn="0" w:noHBand="0" w:noVBand="1"/>
       </w:tblPr>
       <w:tblGrid>
-        <w:gridCol w:w="3340"/>
-        <w:gridCol w:w="2530"/>
-        <w:gridCol w:w="2304"/>
-        <w:gridCol w:w="4101"/>
-        <w:gridCol w:w="1754"/>
+        <w:gridCol w:w="3968"/>
+        <w:gridCol w:w="2373"/>
+        <w:gridCol w:w="2202"/>
+        <w:gridCol w:w="3818"/>
+        <w:gridCol w:w="1668"/>
       </w:tblGrid>
       <w:tr>
         <w:trPr>
@@ -315,10 +315,7 @@
               </w:rPr>
             </w:pPr>
             <w:r>
-              <w:t>Consulta de dades d’un vehicle per a sancions</w:t>
-            </w:r>
-            <w:r>
-              <w:t>.</w:t>
+              <w:t>Consulta de dades d’un vehicle per a sancions.</w:t>
             </w:r>
           </w:p>
         </w:tc>
@@ -707,13 +704,7 @@
               <w:cnfStyle w:val="000000100000" w:firstRow="0" w:lastRow="0" w:firstColumn="0" w:lastColumn="0" w:oddVBand="0" w:evenVBand="0" w:oddHBand="1" w:evenHBand="0" w:firstRowFirstColumn="0" w:firstRowLastColumn="0" w:lastRowFirstColumn="0" w:lastRowLastColumn="0"/>
             </w:pPr>
             <w:r>
-              <w:t>Consulta dels vehicles</w:t>
-            </w:r>
-            <w:r>
-              <w:t xml:space="preserve"> </w:t>
-            </w:r>
-            <w:r>
-              <w:t>enregistrats a la DGT per a un propietari.</w:t>
+              <w:t>Consulta dels vehicles enregistrats a la DGT per a un propietari.</w:t>
             </w:r>
           </w:p>
         </w:tc>
@@ -955,6 +946,269 @@
           <w:p>
             <w:pPr>
               <w:cnfStyle w:val="000000000000" w:firstRow="0" w:lastRow="0" w:firstColumn="0" w:lastColumn="0" w:oddVBand="0" w:evenVBand="0" w:oddHBand="0" w:evenHBand="0" w:firstRowFirstColumn="0" w:firstRowLastColumn="0" w:lastRowFirstColumn="0" w:lastRowLastColumn="0"/>
+              <w:rPr>
+                <w:i/>
+                <w:sz w:val="20"/>
+                <w:szCs w:val="20"/>
+              </w:rPr>
+            </w:pPr>
+          </w:p>
+          <w:p>
+            <w:pPr>
+              <w:cnfStyle w:val="000000000000" w:firstRow="0" w:lastRow="0" w:firstColumn="0" w:lastColumn="0" w:oddVBand="0" w:evenVBand="0" w:oddHBand="0" w:evenHBand="0" w:firstRowFirstColumn="0" w:firstRowLastColumn="0" w:lastRowFirstColumn="0" w:lastRowLastColumn="0"/>
+              <w:rPr>
+                <w:i/>
+                <w:sz w:val="20"/>
+                <w:szCs w:val="20"/>
+              </w:rPr>
+            </w:pPr>
+          </w:p>
+        </w:tc>
+      </w:tr>
+      <w:tr>
+        <w:trPr>
+          <w:cnfStyle w:val="000000100000" w:firstRow="0" w:lastRow="0" w:firstColumn="0" w:lastColumn="0" w:oddVBand="0" w:evenVBand="0" w:oddHBand="1" w:evenHBand="0" w:firstRowFirstColumn="0" w:firstRowLastColumn="0" w:lastRowFirstColumn="0" w:lastRowLastColumn="0"/>
+        </w:trPr>
+        <w:tc>
+          <w:tcPr>
+            <w:cnfStyle w:val="001000000000" w:firstRow="0" w:lastRow="0" w:firstColumn="1" w:lastColumn="0" w:oddVBand="0" w:evenVBand="0" w:oddHBand="0" w:evenHBand="0" w:firstRowFirstColumn="0" w:firstRowLastColumn="0" w:lastRowFirstColumn="0" w:lastRowLastColumn="0"/>
+            <w:tcW w:w="3340" w:type="dxa"/>
+            <w:vAlign w:val="center"/>
+          </w:tcPr>
+          <w:p>
+            <w:pPr>
+              <w:jc w:val="center"/>
+            </w:pPr>
+            <w:r>
+              <w:rPr>
+                <w:lang w:val="es-ES"/>
+              </w:rPr>
+              <w:t>DGT_VERIFICACIO_TITULAR</w:t>
+            </w:r>
+          </w:p>
+        </w:tc>
+        <w:tc>
+          <w:tcPr>
+            <w:tcW w:w="2530" w:type="dxa"/>
+          </w:tcPr>
+          <w:p>
+            <w:pPr>
+              <w:jc w:val="both"/>
+              <w:cnfStyle w:val="000000100000" w:firstRow="0" w:lastRow="0" w:firstColumn="0" w:lastColumn="0" w:oddVBand="0" w:evenVBand="0" w:oddHBand="1" w:evenHBand="0" w:firstRowFirstColumn="0" w:firstRowLastColumn="0" w:lastRowFirstColumn="0" w:lastRowLastColumn="0"/>
+              <w:rPr>
+                <w:sz w:val="20"/>
+                <w:szCs w:val="20"/>
+              </w:rPr>
+            </w:pPr>
+          </w:p>
+        </w:tc>
+        <w:tc>
+          <w:tcPr>
+            <w:tcW w:w="2304" w:type="dxa"/>
+          </w:tcPr>
+          <w:p>
+            <w:pPr>
+              <w:jc w:val="both"/>
+              <w:cnfStyle w:val="000000100000" w:firstRow="0" w:lastRow="0" w:firstColumn="0" w:lastColumn="0" w:oddVBand="0" w:evenVBand="0" w:oddHBand="1" w:evenHBand="0" w:firstRowFirstColumn="0" w:firstRowLastColumn="0" w:lastRowFirstColumn="0" w:lastRowLastColumn="0"/>
+              <w:rPr>
+                <w:sz w:val="20"/>
+                <w:szCs w:val="20"/>
+              </w:rPr>
+            </w:pPr>
+          </w:p>
+        </w:tc>
+        <w:tc>
+          <w:tcPr>
+            <w:tcW w:w="4101" w:type="dxa"/>
+            <w:vAlign w:val="center"/>
+          </w:tcPr>
+          <w:p>
+            <w:pPr>
+              <w:cnfStyle w:val="000000100000" w:firstRow="0" w:lastRow="0" w:firstColumn="0" w:lastColumn="0" w:oddVBand="0" w:evenVBand="0" w:oddHBand="1" w:evenHBand="0" w:firstRowFirstColumn="0" w:firstRowLastColumn="0" w:lastRowFirstColumn="0" w:lastRowLastColumn="0"/>
+            </w:pPr>
+            <w:r>
+              <w:rPr>
+                <w:lang w:val="es-ES"/>
+              </w:rPr>
+              <w:t>Verificació del titular d’un vehicle.</w:t>
+            </w:r>
+          </w:p>
+        </w:tc>
+        <w:tc>
+          <w:tcPr>
+            <w:tcW w:w="1754" w:type="dxa"/>
+          </w:tcPr>
+          <w:p>
+            <w:pPr>
+              <w:cnfStyle w:val="000000100000" w:firstRow="0" w:lastRow="0" w:firstColumn="0" w:lastColumn="0" w:oddVBand="0" w:evenVBand="0" w:oddHBand="1" w:evenHBand="0" w:firstRowFirstColumn="0" w:firstRowLastColumn="0" w:lastRowFirstColumn="0" w:lastRowLastColumn="0"/>
+              <w:rPr>
+                <w:i/>
+                <w:sz w:val="20"/>
+                <w:szCs w:val="20"/>
+              </w:rPr>
+            </w:pPr>
+          </w:p>
+        </w:tc>
+      </w:tr>
+      <w:tr>
+        <w:tc>
+          <w:tcPr>
+            <w:cnfStyle w:val="001000000000" w:firstRow="0" w:lastRow="0" w:firstColumn="1" w:lastColumn="0" w:oddVBand="0" w:evenVBand="0" w:oddHBand="0" w:evenHBand="0" w:firstRowFirstColumn="0" w:firstRowLastColumn="0" w:lastRowFirstColumn="0" w:lastRowLastColumn="0"/>
+            <w:tcW w:w="3340" w:type="dxa"/>
+            <w:vAlign w:val="center"/>
+          </w:tcPr>
+          <w:p>
+            <w:pPr>
+              <w:jc w:val="center"/>
+            </w:pPr>
+            <w:r>
+              <w:rPr>
+                <w:lang w:val="es-ES"/>
+              </w:rPr>
+              <w:t>DGT_HISTORIAL_DOMICILIS_PROPIETARI</w:t>
+            </w:r>
+          </w:p>
+        </w:tc>
+        <w:tc>
+          <w:tcPr>
+            <w:tcW w:w="2530" w:type="dxa"/>
+          </w:tcPr>
+          <w:p>
+            <w:pPr>
+              <w:jc w:val="both"/>
+              <w:cnfStyle w:val="000000000000" w:firstRow="0" w:lastRow="0" w:firstColumn="0" w:lastColumn="0" w:oddVBand="0" w:evenVBand="0" w:oddHBand="0" w:evenHBand="0" w:firstRowFirstColumn="0" w:firstRowLastColumn="0" w:lastRowFirstColumn="0" w:lastRowLastColumn="0"/>
+              <w:rPr>
+                <w:sz w:val="20"/>
+                <w:szCs w:val="20"/>
+              </w:rPr>
+            </w:pPr>
+          </w:p>
+        </w:tc>
+        <w:tc>
+          <w:tcPr>
+            <w:tcW w:w="2304" w:type="dxa"/>
+          </w:tcPr>
+          <w:p>
+            <w:pPr>
+              <w:jc w:val="both"/>
+              <w:cnfStyle w:val="000000000000" w:firstRow="0" w:lastRow="0" w:firstColumn="0" w:lastColumn="0" w:oddVBand="0" w:evenVBand="0" w:oddHBand="0" w:evenHBand="0" w:firstRowFirstColumn="0" w:firstRowLastColumn="0" w:lastRowFirstColumn="0" w:lastRowLastColumn="0"/>
+              <w:rPr>
+                <w:sz w:val="20"/>
+                <w:szCs w:val="20"/>
+              </w:rPr>
+            </w:pPr>
+          </w:p>
+        </w:tc>
+        <w:tc>
+          <w:tcPr>
+            <w:tcW w:w="4101" w:type="dxa"/>
+            <w:vAlign w:val="center"/>
+          </w:tcPr>
+          <w:p>
+            <w:pPr>
+              <w:cnfStyle w:val="000000000000" w:firstRow="0" w:lastRow="0" w:firstColumn="0" w:lastColumn="0" w:oddVBand="0" w:evenVBand="0" w:oddHBand="0" w:evenHBand="0" w:firstRowFirstColumn="0" w:firstRowLastColumn="0" w:lastRowFirstColumn="0" w:lastRowLastColumn="0"/>
+            </w:pPr>
+            <w:r>
+              <w:rPr>
+                <w:lang w:val="es-ES"/>
+              </w:rPr>
+              <w:t>Historial de domicilis d’un propietari.</w:t>
+            </w:r>
+          </w:p>
+        </w:tc>
+        <w:tc>
+          <w:tcPr>
+            <w:tcW w:w="1754" w:type="dxa"/>
+          </w:tcPr>
+          <w:p>
+            <w:pPr>
+              <w:cnfStyle w:val="000000000000" w:firstRow="0" w:lastRow="0" w:firstColumn="0" w:lastColumn="0" w:oddVBand="0" w:evenVBand="0" w:oddHBand="0" w:evenHBand="0" w:firstRowFirstColumn="0" w:firstRowLastColumn="0" w:lastRowFirstColumn="0" w:lastRowLastColumn="0"/>
+              <w:rPr>
+                <w:i/>
+                <w:sz w:val="20"/>
+                <w:szCs w:val="20"/>
+              </w:rPr>
+            </w:pPr>
+          </w:p>
+        </w:tc>
+      </w:tr>
+      <w:tr>
+        <w:trPr>
+          <w:cnfStyle w:val="000000100000" w:firstRow="0" w:lastRow="0" w:firstColumn="0" w:lastColumn="0" w:oddVBand="0" w:evenVBand="0" w:oddHBand="1" w:evenHBand="0" w:firstRowFirstColumn="0" w:firstRowLastColumn="0" w:lastRowFirstColumn="0" w:lastRowLastColumn="0"/>
+        </w:trPr>
+        <w:tc>
+          <w:tcPr>
+            <w:cnfStyle w:val="001000000000" w:firstRow="0" w:lastRow="0" w:firstColumn="1" w:lastColumn="0" w:oddVBand="0" w:evenVBand="0" w:oddHBand="0" w:evenHBand="0" w:firstRowFirstColumn="0" w:firstRowLastColumn="0" w:lastRowFirstColumn="0" w:lastRowLastColumn="0"/>
+            <w:tcW w:w="3340" w:type="dxa"/>
+            <w:vAlign w:val="center"/>
+          </w:tcPr>
+          <w:p>
+            <w:pPr>
+              <w:jc w:val="center"/>
+            </w:pPr>
+            <w:r>
+              <w:rPr>
+                <w:lang w:val="es-ES"/>
+              </w:rPr>
+              <w:lastRenderedPageBreak/>
+              <w:t>DGT_HISTORIAL_DOMICILIS_VEHICLE</w:t>
+            </w:r>
+          </w:p>
+        </w:tc>
+        <w:tc>
+          <w:tcPr>
+            <w:tcW w:w="2530" w:type="dxa"/>
+          </w:tcPr>
+          <w:p>
+            <w:pPr>
+              <w:jc w:val="both"/>
+              <w:cnfStyle w:val="000000100000" w:firstRow="0" w:lastRow="0" w:firstColumn="0" w:lastColumn="0" w:oddVBand="0" w:evenVBand="0" w:oddHBand="1" w:evenHBand="0" w:firstRowFirstColumn="0" w:firstRowLastColumn="0" w:lastRowFirstColumn="0" w:lastRowLastColumn="0"/>
+              <w:rPr>
+                <w:sz w:val="20"/>
+                <w:szCs w:val="20"/>
+              </w:rPr>
+            </w:pPr>
+          </w:p>
+        </w:tc>
+        <w:tc>
+          <w:tcPr>
+            <w:tcW w:w="2304" w:type="dxa"/>
+          </w:tcPr>
+          <w:p>
+            <w:pPr>
+              <w:jc w:val="both"/>
+              <w:cnfStyle w:val="000000100000" w:firstRow="0" w:lastRow="0" w:firstColumn="0" w:lastColumn="0" w:oddVBand="0" w:evenVBand="0" w:oddHBand="1" w:evenHBand="0" w:firstRowFirstColumn="0" w:firstRowLastColumn="0" w:lastRowFirstColumn="0" w:lastRowLastColumn="0"/>
+              <w:rPr>
+                <w:sz w:val="20"/>
+                <w:szCs w:val="20"/>
+              </w:rPr>
+            </w:pPr>
+          </w:p>
+        </w:tc>
+        <w:tc>
+          <w:tcPr>
+            <w:tcW w:w="4101" w:type="dxa"/>
+            <w:vAlign w:val="center"/>
+          </w:tcPr>
+          <w:p>
+            <w:pPr>
+              <w:cnfStyle w:val="000000100000" w:firstRow="0" w:lastRow="0" w:firstColumn="0" w:lastColumn="0" w:oddVBand="0" w:evenVBand="0" w:oddHBand="1" w:evenHBand="0" w:firstRowFirstColumn="0" w:firstRowLastColumn="0" w:lastRowFirstColumn="0" w:lastRowLastColumn="0"/>
+            </w:pPr>
+            <w:r>
+              <w:rPr>
+                <w:lang w:val="es-ES"/>
+              </w:rPr>
+              <w:t>Historial de domicilis d’un vehicle.</w:t>
+            </w:r>
+          </w:p>
+        </w:tc>
+        <w:tc>
+          <w:tcPr>
+            <w:tcW w:w="1754" w:type="dxa"/>
+          </w:tcPr>
+          <w:p>
+            <w:pPr>
+              <w:cnfStyle w:val="000000100000" w:firstRow="0" w:lastRow="0" w:firstColumn="0" w:lastColumn="0" w:oddVBand="0" w:evenVBand="0" w:oddHBand="1" w:evenHBand="0" w:firstRowFirstColumn="0" w:firstRowLastColumn="0" w:lastRowFirstColumn="0" w:lastRowLastColumn="0"/>
               <w:rPr>
                 <w:i/>
                 <w:sz w:val="20"/>
@@ -1007,7 +1261,6 @@
         <w:jc w:val="both"/>
       </w:pPr>
       <w:r>
-        <w:lastRenderedPageBreak/>
         <w:t xml:space="preserve">L’ID de petició de a nivell de PCI ha de ser únic. Per tant, es recomana que es generi de la següent manera: </w:t>
       </w:r>
       <w:r>
@@ -1133,7 +1386,7 @@
 </file>
 
 <file path=word/endnotes.xml><?xml version="1.0" encoding="utf-8"?>
-<w:endnotes xmlns:wpc="http://schemas.microsoft.com/office/word/2010/wordprocessingCanvas" xmlns:cx="http://schemas.microsoft.com/office/drawing/2014/chartex" xmlns:cx1="http://schemas.microsoft.com/office/drawing/2015/9/8/chartex" xmlns:cx2="http://schemas.microsoft.com/office/drawing/2015/10/21/chartex" xmlns:cx3="http://schemas.microsoft.com/office/drawing/2016/5/9/chartex" xmlns:cx4="http://schemas.microsoft.com/office/drawing/2016/5/10/chartex" xmlns:cx5="http://schemas.microsoft.com/office/drawing/2016/5/11/chartex" xmlns:cx6="http://schemas.microsoft.com/office/drawing/2016/5/12/chartex" xmlns:cx7="http://schemas.microsoft.com/office/drawing/2016/5/13/chartex" xmlns:cx8="http://schemas.microsoft.com/office/drawing/2016/5/14/chartex" xmlns:mc="http://schemas.openxmlformats.org/markup-compatibility/2006" xmlns:aink="http://schemas.microsoft.com/office/drawing/2016/ink" xmlns:am3d="http://schemas.microsoft.com/office/drawing/2017/model3d" xmlns:o="urn:schemas-microsoft-com:office:office" xmlns:oel="http://schemas.microsoft.com/office/2019/extlst" xmlns:r="http://schemas.openxmlformats.org/officeDocument/2006/relationships" xmlns:m="http://schemas.openxmlformats.org/officeDocument/2006/math" xmlns:v="urn:schemas-microsoft-com:vml" xmlns:wp14="http://schemas.microsoft.com/office/word/2010/wordprocessingDrawing" xmlns:wp="http://schemas.openxmlformats.org/drawingml/2006/wordprocessingDrawing" xmlns:w10="urn:schemas-microsoft-com:office:word" xmlns:w="http://schemas.openxmlformats.org/wordprocessingml/2006/main" xmlns:w14="http://schemas.microsoft.com/office/word/2010/wordml" xmlns:w15="http://schemas.microsoft.com/office/word/2012/wordml" xmlns:w16cex="http://schemas.microsoft.com/office/word/2018/wordml/cex" xmlns:w16cid="http://schemas.microsoft.com/office/word/2016/wordml/cid" xmlns:w16="http://schemas.microsoft.com/office/word/2018/wordml" xmlns:w16sdtdh="http://schemas.microsoft.com/office/word/2020/wordml/sdtdatahash" xmlns:w16se="http://schemas.microsoft.com/office/word/2015/wordml/symex" xmlns:wpg="http://schemas.microsoft.com/office/word/2010/wordprocessingGroup" xmlns:wpi="http://schemas.microsoft.com/office/word/2010/wordprocessingInk" xmlns:wne="http://schemas.microsoft.com/office/word/2006/wordml" xmlns:wps="http://schemas.microsoft.com/office/word/2010/wordprocessingShape" mc:Ignorable="w14 w15 w16se w16cid w16 w16cex w16sdtdh wp14">
+<w:endnotes xmlns:wpc="http://schemas.microsoft.com/office/word/2010/wordprocessingCanvas" xmlns:cx="http://schemas.microsoft.com/office/drawing/2014/chartex" xmlns:cx1="http://schemas.microsoft.com/office/drawing/2015/9/8/chartex" xmlns:cx2="http://schemas.microsoft.com/office/drawing/2015/10/21/chartex" xmlns:cx3="http://schemas.microsoft.com/office/drawing/2016/5/9/chartex" xmlns:cx4="http://schemas.microsoft.com/office/drawing/2016/5/10/chartex" xmlns:cx5="http://schemas.microsoft.com/office/drawing/2016/5/11/chartex" xmlns:cx6="http://schemas.microsoft.com/office/drawing/2016/5/12/chartex" xmlns:cx7="http://schemas.microsoft.com/office/drawing/2016/5/13/chartex" xmlns:cx8="http://schemas.microsoft.com/office/drawing/2016/5/14/chartex" xmlns:mc="http://schemas.openxmlformats.org/markup-compatibility/2006" xmlns:aink="http://schemas.microsoft.com/office/drawing/2016/ink" xmlns:am3d="http://schemas.microsoft.com/office/drawing/2017/model3d" xmlns:o="urn:schemas-microsoft-com:office:office" xmlns:oel="http://schemas.microsoft.com/office/2019/extlst" xmlns:r="http://schemas.openxmlformats.org/officeDocument/2006/relationships" xmlns:m="http://schemas.openxmlformats.org/officeDocument/2006/math" xmlns:v="urn:schemas-microsoft-com:vml" xmlns:wp14="http://schemas.microsoft.com/office/word/2010/wordprocessingDrawing" xmlns:wp="http://schemas.openxmlformats.org/drawingml/2006/wordprocessingDrawing" xmlns:w10="urn:schemas-microsoft-com:office:word" xmlns:w="http://schemas.openxmlformats.org/wordprocessingml/2006/main" xmlns:w14="http://schemas.microsoft.com/office/word/2010/wordml" xmlns:w15="http://schemas.microsoft.com/office/word/2012/wordml" xmlns:w16cex="http://schemas.microsoft.com/office/word/2018/wordml/cex" xmlns:w16cid="http://schemas.microsoft.com/office/word/2016/wordml/cid" xmlns:w16="http://schemas.microsoft.com/office/word/2018/wordml" xmlns:w16du="http://schemas.microsoft.com/office/word/2023/wordml/word16du" xmlns:w16sdtdh="http://schemas.microsoft.com/office/word/2020/wordml/sdtdatahash" xmlns:w16sdtfl="http://schemas.microsoft.com/office/word/2024/wordml/sdtformatlock" xmlns:w16se="http://schemas.microsoft.com/office/word/2015/wordml/symex" xmlns:wpg="http://schemas.microsoft.com/office/word/2010/wordprocessingGroup" xmlns:wpi="http://schemas.microsoft.com/office/word/2010/wordprocessingInk" xmlns:wne="http://schemas.microsoft.com/office/word/2006/wordml" xmlns:wps="http://schemas.microsoft.com/office/word/2010/wordprocessingShape" mc:Ignorable="w14 w15 w16se w16cid w16 w16cex w16sdtdh w16sdtfl w16du wp14">
   <w:endnote w:type="separator" w:id="-1">
     <w:p>
       <w:pPr>
@@ -1158,7 +1411,7 @@
 </file>
 
 <file path=word/footer1.xml><?xml version="1.0" encoding="utf-8"?>
-<w:ftr xmlns:wpc="http://schemas.microsoft.com/office/word/2010/wordprocessingCanvas" xmlns:cx="http://schemas.microsoft.com/office/drawing/2014/chartex" xmlns:cx1="http://schemas.microsoft.com/office/drawing/2015/9/8/chartex" xmlns:cx2="http://schemas.microsoft.com/office/drawing/2015/10/21/chartex" xmlns:cx3="http://schemas.microsoft.com/office/drawing/2016/5/9/chartex" xmlns:cx4="http://schemas.microsoft.com/office/drawing/2016/5/10/chartex" xmlns:cx5="http://schemas.microsoft.com/office/drawing/2016/5/11/chartex" xmlns:cx6="http://schemas.microsoft.com/office/drawing/2016/5/12/chartex" xmlns:cx7="http://schemas.microsoft.com/office/drawing/2016/5/13/chartex" xmlns:cx8="http://schemas.microsoft.com/office/drawing/2016/5/14/chartex" xmlns:mc="http://schemas.openxmlformats.org/markup-compatibility/2006" xmlns:aink="http://schemas.microsoft.com/office/drawing/2016/ink" xmlns:am3d="http://schemas.microsoft.com/office/drawing/2017/model3d" xmlns:o="urn:schemas-microsoft-com:office:office" xmlns:oel="http://schemas.microsoft.com/office/2019/extlst" xmlns:r="http://schemas.openxmlformats.org/officeDocument/2006/relationships" xmlns:m="http://schemas.openxmlformats.org/officeDocument/2006/math" xmlns:v="urn:schemas-microsoft-com:vml" xmlns:wp14="http://schemas.microsoft.com/office/word/2010/wordprocessingDrawing" xmlns:wp="http://schemas.openxmlformats.org/drawingml/2006/wordprocessingDrawing" xmlns:w10="urn:schemas-microsoft-com:office:word" xmlns:w="http://schemas.openxmlformats.org/wordprocessingml/2006/main" xmlns:w14="http://schemas.microsoft.com/office/word/2010/wordml" xmlns:w15="http://schemas.microsoft.com/office/word/2012/wordml" xmlns:w16cex="http://schemas.microsoft.com/office/word/2018/wordml/cex" xmlns:w16cid="http://schemas.microsoft.com/office/word/2016/wordml/cid" xmlns:w16="http://schemas.microsoft.com/office/word/2018/wordml" xmlns:w16sdtdh="http://schemas.microsoft.com/office/word/2020/wordml/sdtdatahash" xmlns:w16se="http://schemas.microsoft.com/office/word/2015/wordml/symex" xmlns:wpg="http://schemas.microsoft.com/office/word/2010/wordprocessingGroup" xmlns:wpi="http://schemas.microsoft.com/office/word/2010/wordprocessingInk" xmlns:wne="http://schemas.microsoft.com/office/word/2006/wordml" xmlns:wps="http://schemas.microsoft.com/office/word/2010/wordprocessingShape" mc:Ignorable="w14 w15 w16se w16cid w16 w16cex w16sdtdh wp14">
+<w:ftr xmlns:wpc="http://schemas.microsoft.com/office/word/2010/wordprocessingCanvas" xmlns:cx="http://schemas.microsoft.com/office/drawing/2014/chartex" xmlns:cx1="http://schemas.microsoft.com/office/drawing/2015/9/8/chartex" xmlns:cx2="http://schemas.microsoft.com/office/drawing/2015/10/21/chartex" xmlns:cx3="http://schemas.microsoft.com/office/drawing/2016/5/9/chartex" xmlns:cx4="http://schemas.microsoft.com/office/drawing/2016/5/10/chartex" xmlns:cx5="http://schemas.microsoft.com/office/drawing/2016/5/11/chartex" xmlns:cx6="http://schemas.microsoft.com/office/drawing/2016/5/12/chartex" xmlns:cx7="http://schemas.microsoft.com/office/drawing/2016/5/13/chartex" xmlns:cx8="http://schemas.microsoft.com/office/drawing/2016/5/14/chartex" xmlns:mc="http://schemas.openxmlformats.org/markup-compatibility/2006" xmlns:aink="http://schemas.microsoft.com/office/drawing/2016/ink" xmlns:am3d="http://schemas.microsoft.com/office/drawing/2017/model3d" xmlns:o="urn:schemas-microsoft-com:office:office" xmlns:oel="http://schemas.microsoft.com/office/2019/extlst" xmlns:r="http://schemas.openxmlformats.org/officeDocument/2006/relationships" xmlns:m="http://schemas.openxmlformats.org/officeDocument/2006/math" xmlns:v="urn:schemas-microsoft-com:vml" xmlns:wp14="http://schemas.microsoft.com/office/word/2010/wordprocessingDrawing" xmlns:wp="http://schemas.openxmlformats.org/drawingml/2006/wordprocessingDrawing" xmlns:w10="urn:schemas-microsoft-com:office:word" xmlns:w="http://schemas.openxmlformats.org/wordprocessingml/2006/main" xmlns:w14="http://schemas.microsoft.com/office/word/2010/wordml" xmlns:w15="http://schemas.microsoft.com/office/word/2012/wordml" xmlns:w16cex="http://schemas.microsoft.com/office/word/2018/wordml/cex" xmlns:w16cid="http://schemas.microsoft.com/office/word/2016/wordml/cid" xmlns:w16="http://schemas.microsoft.com/office/word/2018/wordml" xmlns:w16du="http://schemas.microsoft.com/office/word/2023/wordml/word16du" xmlns:w16sdtdh="http://schemas.microsoft.com/office/word/2020/wordml/sdtdatahash" xmlns:w16sdtfl="http://schemas.microsoft.com/office/word/2024/wordml/sdtformatlock" xmlns:w16se="http://schemas.microsoft.com/office/word/2015/wordml/symex" xmlns:wpg="http://schemas.microsoft.com/office/word/2010/wordprocessingGroup" xmlns:wpi="http://schemas.microsoft.com/office/word/2010/wordprocessingInk" xmlns:wne="http://schemas.microsoft.com/office/word/2006/wordml" xmlns:wps="http://schemas.microsoft.com/office/word/2010/wordprocessingShape" mc:Ignorable="w14 w15 w16se w16cid w16 w16cex w16sdtdh w16sdtfl w16du wp14">
   <w:p>
     <w:pPr>
       <w:pStyle w:val="Piedepgina"/>
@@ -1168,7 +1421,7 @@
 </file>
 
 <file path=word/footer2.xml><?xml version="1.0" encoding="utf-8"?>
-<w:ftr xmlns:wpc="http://schemas.microsoft.com/office/word/2010/wordprocessingCanvas" xmlns:cx="http://schemas.microsoft.com/office/drawing/2014/chartex" xmlns:cx1="http://schemas.microsoft.com/office/drawing/2015/9/8/chartex" xmlns:cx2="http://schemas.microsoft.com/office/drawing/2015/10/21/chartex" xmlns:cx3="http://schemas.microsoft.com/office/drawing/2016/5/9/chartex" xmlns:cx4="http://schemas.microsoft.com/office/drawing/2016/5/10/chartex" xmlns:cx5="http://schemas.microsoft.com/office/drawing/2016/5/11/chartex" xmlns:cx6="http://schemas.microsoft.com/office/drawing/2016/5/12/chartex" xmlns:cx7="http://schemas.microsoft.com/office/drawing/2016/5/13/chartex" xmlns:cx8="http://schemas.microsoft.com/office/drawing/2016/5/14/chartex" xmlns:mc="http://schemas.openxmlformats.org/markup-compatibility/2006" xmlns:aink="http://schemas.microsoft.com/office/drawing/2016/ink" xmlns:am3d="http://schemas.microsoft.com/office/drawing/2017/model3d" xmlns:o="urn:schemas-microsoft-com:office:office" xmlns:oel="http://schemas.microsoft.com/office/2019/extlst" xmlns:r="http://schemas.openxmlformats.org/officeDocument/2006/relationships" xmlns:m="http://schemas.openxmlformats.org/officeDocument/2006/math" xmlns:v="urn:schemas-microsoft-com:vml" xmlns:wp14="http://schemas.microsoft.com/office/word/2010/wordprocessingDrawing" xmlns:wp="http://schemas.openxmlformats.org/drawingml/2006/wordprocessingDrawing" xmlns:w10="urn:schemas-microsoft-com:office:word" xmlns:w="http://schemas.openxmlformats.org/wordprocessingml/2006/main" xmlns:w14="http://schemas.microsoft.com/office/word/2010/wordml" xmlns:w15="http://schemas.microsoft.com/office/word/2012/wordml" xmlns:w16cex="http://schemas.microsoft.com/office/word/2018/wordml/cex" xmlns:w16cid="http://schemas.microsoft.com/office/word/2016/wordml/cid" xmlns:w16="http://schemas.microsoft.com/office/word/2018/wordml" xmlns:w16sdtdh="http://schemas.microsoft.com/office/word/2020/wordml/sdtdatahash" xmlns:w16se="http://schemas.microsoft.com/office/word/2015/wordml/symex" xmlns:wpg="http://schemas.microsoft.com/office/word/2010/wordprocessingGroup" xmlns:wpi="http://schemas.microsoft.com/office/word/2010/wordprocessingInk" xmlns:wne="http://schemas.microsoft.com/office/word/2006/wordml" xmlns:wps="http://schemas.microsoft.com/office/word/2010/wordprocessingShape" mc:Ignorable="w14 w15 w16se w16cid w16 w16cex w16sdtdh wp14">
+<w:ftr xmlns:wpc="http://schemas.microsoft.com/office/word/2010/wordprocessingCanvas" xmlns:cx="http://schemas.microsoft.com/office/drawing/2014/chartex" xmlns:cx1="http://schemas.microsoft.com/office/drawing/2015/9/8/chartex" xmlns:cx2="http://schemas.microsoft.com/office/drawing/2015/10/21/chartex" xmlns:cx3="http://schemas.microsoft.com/office/drawing/2016/5/9/chartex" xmlns:cx4="http://schemas.microsoft.com/office/drawing/2016/5/10/chartex" xmlns:cx5="http://schemas.microsoft.com/office/drawing/2016/5/11/chartex" xmlns:cx6="http://schemas.microsoft.com/office/drawing/2016/5/12/chartex" xmlns:cx7="http://schemas.microsoft.com/office/drawing/2016/5/13/chartex" xmlns:cx8="http://schemas.microsoft.com/office/drawing/2016/5/14/chartex" xmlns:mc="http://schemas.openxmlformats.org/markup-compatibility/2006" xmlns:aink="http://schemas.microsoft.com/office/drawing/2016/ink" xmlns:am3d="http://schemas.microsoft.com/office/drawing/2017/model3d" xmlns:o="urn:schemas-microsoft-com:office:office" xmlns:oel="http://schemas.microsoft.com/office/2019/extlst" xmlns:r="http://schemas.openxmlformats.org/officeDocument/2006/relationships" xmlns:m="http://schemas.openxmlformats.org/officeDocument/2006/math" xmlns:v="urn:schemas-microsoft-com:vml" xmlns:wp14="http://schemas.microsoft.com/office/word/2010/wordprocessingDrawing" xmlns:wp="http://schemas.openxmlformats.org/drawingml/2006/wordprocessingDrawing" xmlns:w10="urn:schemas-microsoft-com:office:word" xmlns:w="http://schemas.openxmlformats.org/wordprocessingml/2006/main" xmlns:w14="http://schemas.microsoft.com/office/word/2010/wordml" xmlns:w15="http://schemas.microsoft.com/office/word/2012/wordml" xmlns:w16cex="http://schemas.microsoft.com/office/word/2018/wordml/cex" xmlns:w16cid="http://schemas.microsoft.com/office/word/2016/wordml/cid" xmlns:w16="http://schemas.microsoft.com/office/word/2018/wordml" xmlns:w16du="http://schemas.microsoft.com/office/word/2023/wordml/word16du" xmlns:w16sdtdh="http://schemas.microsoft.com/office/word/2020/wordml/sdtdatahash" xmlns:w16sdtfl="http://schemas.microsoft.com/office/word/2024/wordml/sdtformatlock" xmlns:w16se="http://schemas.microsoft.com/office/word/2015/wordml/symex" xmlns:wpg="http://schemas.microsoft.com/office/word/2010/wordprocessingGroup" xmlns:wpi="http://schemas.microsoft.com/office/word/2010/wordprocessingInk" xmlns:wne="http://schemas.microsoft.com/office/word/2006/wordml" xmlns:wps="http://schemas.microsoft.com/office/word/2010/wordprocessingShape" mc:Ignorable="w14 w15 w16se w16cid w16 w16cex w16sdtdh w16sdtfl w16du wp14">
   <w:p>
     <w:pPr>
       <w:pStyle w:val="Piedepgina"/>
@@ -1178,7 +1431,7 @@
 </file>
 
 <file path=word/footer3.xml><?xml version="1.0" encoding="utf-8"?>
-<w:ftr xmlns:wpc="http://schemas.microsoft.com/office/word/2010/wordprocessingCanvas" xmlns:cx="http://schemas.microsoft.com/office/drawing/2014/chartex" xmlns:cx1="http://schemas.microsoft.com/office/drawing/2015/9/8/chartex" xmlns:cx2="http://schemas.microsoft.com/office/drawing/2015/10/21/chartex" xmlns:cx3="http://schemas.microsoft.com/office/drawing/2016/5/9/chartex" xmlns:cx4="http://schemas.microsoft.com/office/drawing/2016/5/10/chartex" xmlns:cx5="http://schemas.microsoft.com/office/drawing/2016/5/11/chartex" xmlns:cx6="http://schemas.microsoft.com/office/drawing/2016/5/12/chartex" xmlns:cx7="http://schemas.microsoft.com/office/drawing/2016/5/13/chartex" xmlns:cx8="http://schemas.microsoft.com/office/drawing/2016/5/14/chartex" xmlns:mc="http://schemas.openxmlformats.org/markup-compatibility/2006" xmlns:aink="http://schemas.microsoft.com/office/drawing/2016/ink" xmlns:am3d="http://schemas.microsoft.com/office/drawing/2017/model3d" xmlns:o="urn:schemas-microsoft-com:office:office" xmlns:oel="http://schemas.microsoft.com/office/2019/extlst" xmlns:r="http://schemas.openxmlformats.org/officeDocument/2006/relationships" xmlns:m="http://schemas.openxmlformats.org/officeDocument/2006/math" xmlns:v="urn:schemas-microsoft-com:vml" xmlns:wp14="http://schemas.microsoft.com/office/word/2010/wordprocessingDrawing" xmlns:wp="http://schemas.openxmlformats.org/drawingml/2006/wordprocessingDrawing" xmlns:w10="urn:schemas-microsoft-com:office:word" xmlns:w="http://schemas.openxmlformats.org/wordprocessingml/2006/main" xmlns:w14="http://schemas.microsoft.com/office/word/2010/wordml" xmlns:w15="http://schemas.microsoft.com/office/word/2012/wordml" xmlns:w16cex="http://schemas.microsoft.com/office/word/2018/wordml/cex" xmlns:w16cid="http://schemas.microsoft.com/office/word/2016/wordml/cid" xmlns:w16="http://schemas.microsoft.com/office/word/2018/wordml" xmlns:w16sdtdh="http://schemas.microsoft.com/office/word/2020/wordml/sdtdatahash" xmlns:w16se="http://schemas.microsoft.com/office/word/2015/wordml/symex" xmlns:wpg="http://schemas.microsoft.com/office/word/2010/wordprocessingGroup" xmlns:wpi="http://schemas.microsoft.com/office/word/2010/wordprocessingInk" xmlns:wne="http://schemas.microsoft.com/office/word/2006/wordml" xmlns:wps="http://schemas.microsoft.com/office/word/2010/wordprocessingShape" mc:Ignorable="w14 w15 w16se w16cid w16 w16cex w16sdtdh wp14">
+<w:ftr xmlns:wpc="http://schemas.microsoft.com/office/word/2010/wordprocessingCanvas" xmlns:cx="http://schemas.microsoft.com/office/drawing/2014/chartex" xmlns:cx1="http://schemas.microsoft.com/office/drawing/2015/9/8/chartex" xmlns:cx2="http://schemas.microsoft.com/office/drawing/2015/10/21/chartex" xmlns:cx3="http://schemas.microsoft.com/office/drawing/2016/5/9/chartex" xmlns:cx4="http://schemas.microsoft.com/office/drawing/2016/5/10/chartex" xmlns:cx5="http://schemas.microsoft.com/office/drawing/2016/5/11/chartex" xmlns:cx6="http://schemas.microsoft.com/office/drawing/2016/5/12/chartex" xmlns:cx7="http://schemas.microsoft.com/office/drawing/2016/5/13/chartex" xmlns:cx8="http://schemas.microsoft.com/office/drawing/2016/5/14/chartex" xmlns:mc="http://schemas.openxmlformats.org/markup-compatibility/2006" xmlns:aink="http://schemas.microsoft.com/office/drawing/2016/ink" xmlns:am3d="http://schemas.microsoft.com/office/drawing/2017/model3d" xmlns:o="urn:schemas-microsoft-com:office:office" xmlns:oel="http://schemas.microsoft.com/office/2019/extlst" xmlns:r="http://schemas.openxmlformats.org/officeDocument/2006/relationships" xmlns:m="http://schemas.openxmlformats.org/officeDocument/2006/math" xmlns:v="urn:schemas-microsoft-com:vml" xmlns:wp14="http://schemas.microsoft.com/office/word/2010/wordprocessingDrawing" xmlns:wp="http://schemas.openxmlformats.org/drawingml/2006/wordprocessingDrawing" xmlns:w10="urn:schemas-microsoft-com:office:word" xmlns:w="http://schemas.openxmlformats.org/wordprocessingml/2006/main" xmlns:w14="http://schemas.microsoft.com/office/word/2010/wordml" xmlns:w15="http://schemas.microsoft.com/office/word/2012/wordml" xmlns:w16cex="http://schemas.microsoft.com/office/word/2018/wordml/cex" xmlns:w16cid="http://schemas.microsoft.com/office/word/2016/wordml/cid" xmlns:w16="http://schemas.microsoft.com/office/word/2018/wordml" xmlns:w16du="http://schemas.microsoft.com/office/word/2023/wordml/word16du" xmlns:w16sdtdh="http://schemas.microsoft.com/office/word/2020/wordml/sdtdatahash" xmlns:w16sdtfl="http://schemas.microsoft.com/office/word/2024/wordml/sdtformatlock" xmlns:w16se="http://schemas.microsoft.com/office/word/2015/wordml/symex" xmlns:wpg="http://schemas.microsoft.com/office/word/2010/wordprocessingGroup" xmlns:wpi="http://schemas.microsoft.com/office/word/2010/wordprocessingInk" xmlns:wne="http://schemas.microsoft.com/office/word/2006/wordml" xmlns:wps="http://schemas.microsoft.com/office/word/2010/wordprocessingShape" mc:Ignorable="w14 w15 w16se w16cid w16 w16cex w16sdtdh w16sdtfl w16du wp14">
   <w:p>
     <w:pPr>
       <w:pStyle w:val="Piedepgina"/>
@@ -1188,7 +1441,7 @@
 </file>
 
 <file path=word/footnotes.xml><?xml version="1.0" encoding="utf-8"?>
-<w:footnotes xmlns:wpc="http://schemas.microsoft.com/office/word/2010/wordprocessingCanvas" xmlns:cx="http://schemas.microsoft.com/office/drawing/2014/chartex" xmlns:cx1="http://schemas.microsoft.com/office/drawing/2015/9/8/chartex" xmlns:cx2="http://schemas.microsoft.com/office/drawing/2015/10/21/chartex" xmlns:cx3="http://schemas.microsoft.com/office/drawing/2016/5/9/chartex" xmlns:cx4="http://schemas.microsoft.com/office/drawing/2016/5/10/chartex" xmlns:cx5="http://schemas.microsoft.com/office/drawing/2016/5/11/chartex" xmlns:cx6="http://schemas.microsoft.com/office/drawing/2016/5/12/chartex" xmlns:cx7="http://schemas.microsoft.com/office/drawing/2016/5/13/chartex" xmlns:cx8="http://schemas.microsoft.com/office/drawing/2016/5/14/chartex" xmlns:mc="http://schemas.openxmlformats.org/markup-compatibility/2006" xmlns:aink="http://schemas.microsoft.com/office/drawing/2016/ink" xmlns:am3d="http://schemas.microsoft.com/office/drawing/2017/model3d" xmlns:o="urn:schemas-microsoft-com:office:office" xmlns:oel="http://schemas.microsoft.com/office/2019/extlst" xmlns:r="http://schemas.openxmlformats.org/officeDocument/2006/relationships" xmlns:m="http://schemas.openxmlformats.org/officeDocument/2006/math" xmlns:v="urn:schemas-microsoft-com:vml" xmlns:wp14="http://schemas.microsoft.com/office/word/2010/wordprocessingDrawing" xmlns:wp="http://schemas.openxmlformats.org/drawingml/2006/wordprocessingDrawing" xmlns:w10="urn:schemas-microsoft-com:office:word" xmlns:w="http://schemas.openxmlformats.org/wordprocessingml/2006/main" xmlns:w14="http://schemas.microsoft.com/office/word/2010/wordml" xmlns:w15="http://schemas.microsoft.com/office/word/2012/wordml" xmlns:w16cex="http://schemas.microsoft.com/office/word/2018/wordml/cex" xmlns:w16cid="http://schemas.microsoft.com/office/word/2016/wordml/cid" xmlns:w16="http://schemas.microsoft.com/office/word/2018/wordml" xmlns:w16sdtdh="http://schemas.microsoft.com/office/word/2020/wordml/sdtdatahash" xmlns:w16se="http://schemas.microsoft.com/office/word/2015/wordml/symex" xmlns:wpg="http://schemas.microsoft.com/office/word/2010/wordprocessingGroup" xmlns:wpi="http://schemas.microsoft.com/office/word/2010/wordprocessingInk" xmlns:wne="http://schemas.microsoft.com/office/word/2006/wordml" xmlns:wps="http://schemas.microsoft.com/office/word/2010/wordprocessingShape" mc:Ignorable="w14 w15 w16se w16cid w16 w16cex w16sdtdh wp14">
+<w:footnotes xmlns:wpc="http://schemas.microsoft.com/office/word/2010/wordprocessingCanvas" xmlns:cx="http://schemas.microsoft.com/office/drawing/2014/chartex" xmlns:cx1="http://schemas.microsoft.com/office/drawing/2015/9/8/chartex" xmlns:cx2="http://schemas.microsoft.com/office/drawing/2015/10/21/chartex" xmlns:cx3="http://schemas.microsoft.com/office/drawing/2016/5/9/chartex" xmlns:cx4="http://schemas.microsoft.com/office/drawing/2016/5/10/chartex" xmlns:cx5="http://schemas.microsoft.com/office/drawing/2016/5/11/chartex" xmlns:cx6="http://schemas.microsoft.com/office/drawing/2016/5/12/chartex" xmlns:cx7="http://schemas.microsoft.com/office/drawing/2016/5/13/chartex" xmlns:cx8="http://schemas.microsoft.com/office/drawing/2016/5/14/chartex" xmlns:mc="http://schemas.openxmlformats.org/markup-compatibility/2006" xmlns:aink="http://schemas.microsoft.com/office/drawing/2016/ink" xmlns:am3d="http://schemas.microsoft.com/office/drawing/2017/model3d" xmlns:o="urn:schemas-microsoft-com:office:office" xmlns:oel="http://schemas.microsoft.com/office/2019/extlst" xmlns:r="http://schemas.openxmlformats.org/officeDocument/2006/relationships" xmlns:m="http://schemas.openxmlformats.org/officeDocument/2006/math" xmlns:v="urn:schemas-microsoft-com:vml" xmlns:wp14="http://schemas.microsoft.com/office/word/2010/wordprocessingDrawing" xmlns:wp="http://schemas.openxmlformats.org/drawingml/2006/wordprocessingDrawing" xmlns:w10="urn:schemas-microsoft-com:office:word" xmlns:w="http://schemas.openxmlformats.org/wordprocessingml/2006/main" xmlns:w14="http://schemas.microsoft.com/office/word/2010/wordml" xmlns:w15="http://schemas.microsoft.com/office/word/2012/wordml" xmlns:w16cex="http://schemas.microsoft.com/office/word/2018/wordml/cex" xmlns:w16cid="http://schemas.microsoft.com/office/word/2016/wordml/cid" xmlns:w16="http://schemas.microsoft.com/office/word/2018/wordml" xmlns:w16du="http://schemas.microsoft.com/office/word/2023/wordml/word16du" xmlns:w16sdtdh="http://schemas.microsoft.com/office/word/2020/wordml/sdtdatahash" xmlns:w16sdtfl="http://schemas.microsoft.com/office/word/2024/wordml/sdtformatlock" xmlns:w16se="http://schemas.microsoft.com/office/word/2015/wordml/symex" xmlns:wpg="http://schemas.microsoft.com/office/word/2010/wordprocessingGroup" xmlns:wpi="http://schemas.microsoft.com/office/word/2010/wordprocessingInk" xmlns:wne="http://schemas.microsoft.com/office/word/2006/wordml" xmlns:wps="http://schemas.microsoft.com/office/word/2010/wordprocessingShape" mc:Ignorable="w14 w15 w16se w16cid w16 w16cex w16sdtdh w16sdtfl w16du wp14">
   <w:footnote w:type="separator" w:id="-1">
     <w:p>
       <w:pPr>
@@ -1213,7 +1466,7 @@
 </file>
 
 <file path=word/header1.xml><?xml version="1.0" encoding="utf-8"?>
-<w:hdr xmlns:wpc="http://schemas.microsoft.com/office/word/2010/wordprocessingCanvas" xmlns:cx="http://schemas.microsoft.com/office/drawing/2014/chartex" xmlns:cx1="http://schemas.microsoft.com/office/drawing/2015/9/8/chartex" xmlns:cx2="http://schemas.microsoft.com/office/drawing/2015/10/21/chartex" xmlns:cx3="http://schemas.microsoft.com/office/drawing/2016/5/9/chartex" xmlns:cx4="http://schemas.microsoft.com/office/drawing/2016/5/10/chartex" xmlns:cx5="http://schemas.microsoft.com/office/drawing/2016/5/11/chartex" xmlns:cx6="http://schemas.microsoft.com/office/drawing/2016/5/12/chartex" xmlns:cx7="http://schemas.microsoft.com/office/drawing/2016/5/13/chartex" xmlns:cx8="http://schemas.microsoft.com/office/drawing/2016/5/14/chartex" xmlns:mc="http://schemas.openxmlformats.org/markup-compatibility/2006" xmlns:aink="http://schemas.microsoft.com/office/drawing/2016/ink" xmlns:am3d="http://schemas.microsoft.com/office/drawing/2017/model3d" xmlns:o="urn:schemas-microsoft-com:office:office" xmlns:oel="http://schemas.microsoft.com/office/2019/extlst" xmlns:r="http://schemas.openxmlformats.org/officeDocument/2006/relationships" xmlns:m="http://schemas.openxmlformats.org/officeDocument/2006/math" xmlns:v="urn:schemas-microsoft-com:vml" xmlns:wp14="http://schemas.microsoft.com/office/word/2010/wordprocessingDrawing" xmlns:wp="http://schemas.openxmlformats.org/drawingml/2006/wordprocessingDrawing" xmlns:w10="urn:schemas-microsoft-com:office:word" xmlns:w="http://schemas.openxmlformats.org/wordprocessingml/2006/main" xmlns:w14="http://schemas.microsoft.com/office/word/2010/wordml" xmlns:w15="http://schemas.microsoft.com/office/word/2012/wordml" xmlns:w16cex="http://schemas.microsoft.com/office/word/2018/wordml/cex" xmlns:w16cid="http://schemas.microsoft.com/office/word/2016/wordml/cid" xmlns:w16="http://schemas.microsoft.com/office/word/2018/wordml" xmlns:w16sdtdh="http://schemas.microsoft.com/office/word/2020/wordml/sdtdatahash" xmlns:w16se="http://schemas.microsoft.com/office/word/2015/wordml/symex" xmlns:wpg="http://schemas.microsoft.com/office/word/2010/wordprocessingGroup" xmlns:wpi="http://schemas.microsoft.com/office/word/2010/wordprocessingInk" xmlns:wne="http://schemas.microsoft.com/office/word/2006/wordml" xmlns:wps="http://schemas.microsoft.com/office/word/2010/wordprocessingShape" mc:Ignorable="w14 w15 w16se w16cid w16 w16cex w16sdtdh wp14">
+<w:hdr xmlns:wpc="http://schemas.microsoft.com/office/word/2010/wordprocessingCanvas" xmlns:cx="http://schemas.microsoft.com/office/drawing/2014/chartex" xmlns:cx1="http://schemas.microsoft.com/office/drawing/2015/9/8/chartex" xmlns:cx2="http://schemas.microsoft.com/office/drawing/2015/10/21/chartex" xmlns:cx3="http://schemas.microsoft.com/office/drawing/2016/5/9/chartex" xmlns:cx4="http://schemas.microsoft.com/office/drawing/2016/5/10/chartex" xmlns:cx5="http://schemas.microsoft.com/office/drawing/2016/5/11/chartex" xmlns:cx6="http://schemas.microsoft.com/office/drawing/2016/5/12/chartex" xmlns:cx7="http://schemas.microsoft.com/office/drawing/2016/5/13/chartex" xmlns:cx8="http://schemas.microsoft.com/office/drawing/2016/5/14/chartex" xmlns:mc="http://schemas.openxmlformats.org/markup-compatibility/2006" xmlns:aink="http://schemas.microsoft.com/office/drawing/2016/ink" xmlns:am3d="http://schemas.microsoft.com/office/drawing/2017/model3d" xmlns:o="urn:schemas-microsoft-com:office:office" xmlns:oel="http://schemas.microsoft.com/office/2019/extlst" xmlns:r="http://schemas.openxmlformats.org/officeDocument/2006/relationships" xmlns:m="http://schemas.openxmlformats.org/officeDocument/2006/math" xmlns:v="urn:schemas-microsoft-com:vml" xmlns:wp14="http://schemas.microsoft.com/office/word/2010/wordprocessingDrawing" xmlns:wp="http://schemas.openxmlformats.org/drawingml/2006/wordprocessingDrawing" xmlns:w10="urn:schemas-microsoft-com:office:word" xmlns:w="http://schemas.openxmlformats.org/wordprocessingml/2006/main" xmlns:w14="http://schemas.microsoft.com/office/word/2010/wordml" xmlns:w15="http://schemas.microsoft.com/office/word/2012/wordml" xmlns:w16cex="http://schemas.microsoft.com/office/word/2018/wordml/cex" xmlns:w16cid="http://schemas.microsoft.com/office/word/2016/wordml/cid" xmlns:w16="http://schemas.microsoft.com/office/word/2018/wordml" xmlns:w16du="http://schemas.microsoft.com/office/word/2023/wordml/word16du" xmlns:w16sdtdh="http://schemas.microsoft.com/office/word/2020/wordml/sdtdatahash" xmlns:w16sdtfl="http://schemas.microsoft.com/office/word/2024/wordml/sdtformatlock" xmlns:w16se="http://schemas.microsoft.com/office/word/2015/wordml/symex" xmlns:wpg="http://schemas.microsoft.com/office/word/2010/wordprocessingGroup" xmlns:wpi="http://schemas.microsoft.com/office/word/2010/wordprocessingInk" xmlns:wne="http://schemas.microsoft.com/office/word/2006/wordml" xmlns:wps="http://schemas.microsoft.com/office/word/2010/wordprocessingShape" mc:Ignorable="w14 w15 w16se w16cid w16 w16cex w16sdtdh w16sdtfl w16du wp14">
   <w:p>
     <w:pPr>
       <w:pStyle w:val="Encabezado"/>
@@ -1223,7 +1476,7 @@
 </file>
 
 <file path=word/header2.xml><?xml version="1.0" encoding="utf-8"?>
-<w:hdr xmlns:wpc="http://schemas.microsoft.com/office/word/2010/wordprocessingCanvas" xmlns:cx="http://schemas.microsoft.com/office/drawing/2014/chartex" xmlns:cx1="http://schemas.microsoft.com/office/drawing/2015/9/8/chartex" xmlns:cx2="http://schemas.microsoft.com/office/drawing/2015/10/21/chartex" xmlns:cx3="http://schemas.microsoft.com/office/drawing/2016/5/9/chartex" xmlns:cx4="http://schemas.microsoft.com/office/drawing/2016/5/10/chartex" xmlns:cx5="http://schemas.microsoft.com/office/drawing/2016/5/11/chartex" xmlns:cx6="http://schemas.microsoft.com/office/drawing/2016/5/12/chartex" xmlns:cx7="http://schemas.microsoft.com/office/drawing/2016/5/13/chartex" xmlns:cx8="http://schemas.microsoft.com/office/drawing/2016/5/14/chartex" xmlns:mc="http://schemas.openxmlformats.org/markup-compatibility/2006" xmlns:aink="http://schemas.microsoft.com/office/drawing/2016/ink" xmlns:am3d="http://schemas.microsoft.com/office/drawing/2017/model3d" xmlns:o="urn:schemas-microsoft-com:office:office" xmlns:oel="http://schemas.microsoft.com/office/2019/extlst" xmlns:r="http://schemas.openxmlformats.org/officeDocument/2006/relationships" xmlns:m="http://schemas.openxmlformats.org/officeDocument/2006/math" xmlns:v="urn:schemas-microsoft-com:vml" xmlns:wp14="http://schemas.microsoft.com/office/word/2010/wordprocessingDrawing" xmlns:wp="http://schemas.openxmlformats.org/drawingml/2006/wordprocessingDrawing" xmlns:w10="urn:schemas-microsoft-com:office:word" xmlns:w="http://schemas.openxmlformats.org/wordprocessingml/2006/main" xmlns:w14="http://schemas.microsoft.com/office/word/2010/wordml" xmlns:w15="http://schemas.microsoft.com/office/word/2012/wordml" xmlns:w16cex="http://schemas.microsoft.com/office/word/2018/wordml/cex" xmlns:w16cid="http://schemas.microsoft.com/office/word/2016/wordml/cid" xmlns:w16="http://schemas.microsoft.com/office/word/2018/wordml" xmlns:w16sdtdh="http://schemas.microsoft.com/office/word/2020/wordml/sdtdatahash" xmlns:w16se="http://schemas.microsoft.com/office/word/2015/wordml/symex" xmlns:wpg="http://schemas.microsoft.com/office/word/2010/wordprocessingGroup" xmlns:wpi="http://schemas.microsoft.com/office/word/2010/wordprocessingInk" xmlns:wne="http://schemas.microsoft.com/office/word/2006/wordml" xmlns:wps="http://schemas.microsoft.com/office/word/2010/wordprocessingShape" mc:Ignorable="w14 w15 w16se w16cid w16 w16cex w16sdtdh wp14">
+<w:hdr xmlns:wpc="http://schemas.microsoft.com/office/word/2010/wordprocessingCanvas" xmlns:cx="http://schemas.microsoft.com/office/drawing/2014/chartex" xmlns:cx1="http://schemas.microsoft.com/office/drawing/2015/9/8/chartex" xmlns:cx2="http://schemas.microsoft.com/office/drawing/2015/10/21/chartex" xmlns:cx3="http://schemas.microsoft.com/office/drawing/2016/5/9/chartex" xmlns:cx4="http://schemas.microsoft.com/office/drawing/2016/5/10/chartex" xmlns:cx5="http://schemas.microsoft.com/office/drawing/2016/5/11/chartex" xmlns:cx6="http://schemas.microsoft.com/office/drawing/2016/5/12/chartex" xmlns:cx7="http://schemas.microsoft.com/office/drawing/2016/5/13/chartex" xmlns:cx8="http://schemas.microsoft.com/office/drawing/2016/5/14/chartex" xmlns:mc="http://schemas.openxmlformats.org/markup-compatibility/2006" xmlns:aink="http://schemas.microsoft.com/office/drawing/2016/ink" xmlns:am3d="http://schemas.microsoft.com/office/drawing/2017/model3d" xmlns:o="urn:schemas-microsoft-com:office:office" xmlns:oel="http://schemas.microsoft.com/office/2019/extlst" xmlns:r="http://schemas.openxmlformats.org/officeDocument/2006/relationships" xmlns:m="http://schemas.openxmlformats.org/officeDocument/2006/math" xmlns:v="urn:schemas-microsoft-com:vml" xmlns:wp14="http://schemas.microsoft.com/office/word/2010/wordprocessingDrawing" xmlns:wp="http://schemas.openxmlformats.org/drawingml/2006/wordprocessingDrawing" xmlns:w10="urn:schemas-microsoft-com:office:word" xmlns:w="http://schemas.openxmlformats.org/wordprocessingml/2006/main" xmlns:w14="http://schemas.microsoft.com/office/word/2010/wordml" xmlns:w15="http://schemas.microsoft.com/office/word/2012/wordml" xmlns:w16cex="http://schemas.microsoft.com/office/word/2018/wordml/cex" xmlns:w16cid="http://schemas.microsoft.com/office/word/2016/wordml/cid" xmlns:w16="http://schemas.microsoft.com/office/word/2018/wordml" xmlns:w16du="http://schemas.microsoft.com/office/word/2023/wordml/word16du" xmlns:w16sdtdh="http://schemas.microsoft.com/office/word/2020/wordml/sdtdatahash" xmlns:w16sdtfl="http://schemas.microsoft.com/office/word/2024/wordml/sdtformatlock" xmlns:w16se="http://schemas.microsoft.com/office/word/2015/wordml/symex" xmlns:wpg="http://schemas.microsoft.com/office/word/2010/wordprocessingGroup" xmlns:wpi="http://schemas.microsoft.com/office/word/2010/wordprocessingInk" xmlns:wne="http://schemas.microsoft.com/office/word/2006/wordml" xmlns:wps="http://schemas.microsoft.com/office/word/2010/wordprocessingShape" mc:Ignorable="w14 w15 w16se w16cid w16 w16cex w16sdtdh w16sdtfl w16du wp14">
   <w:p>
     <w:pPr>
       <w:pStyle w:val="Encabezado"/>
@@ -1392,7 +1645,7 @@
 </file>
 
 <file path=word/header3.xml><?xml version="1.0" encoding="utf-8"?>
-<w:hdr xmlns:wpc="http://schemas.microsoft.com/office/word/2010/wordprocessingCanvas" xmlns:cx="http://schemas.microsoft.com/office/drawing/2014/chartex" xmlns:cx1="http://schemas.microsoft.com/office/drawing/2015/9/8/chartex" xmlns:cx2="http://schemas.microsoft.com/office/drawing/2015/10/21/chartex" xmlns:cx3="http://schemas.microsoft.com/office/drawing/2016/5/9/chartex" xmlns:cx4="http://schemas.microsoft.com/office/drawing/2016/5/10/chartex" xmlns:cx5="http://schemas.microsoft.com/office/drawing/2016/5/11/chartex" xmlns:cx6="http://schemas.microsoft.com/office/drawing/2016/5/12/chartex" xmlns:cx7="http://schemas.microsoft.com/office/drawing/2016/5/13/chartex" xmlns:cx8="http://schemas.microsoft.com/office/drawing/2016/5/14/chartex" xmlns:mc="http://schemas.openxmlformats.org/markup-compatibility/2006" xmlns:aink="http://schemas.microsoft.com/office/drawing/2016/ink" xmlns:am3d="http://schemas.microsoft.com/office/drawing/2017/model3d" xmlns:o="urn:schemas-microsoft-com:office:office" xmlns:oel="http://schemas.microsoft.com/office/2019/extlst" xmlns:r="http://schemas.openxmlformats.org/officeDocument/2006/relationships" xmlns:m="http://schemas.openxmlformats.org/officeDocument/2006/math" xmlns:v="urn:schemas-microsoft-com:vml" xmlns:wp14="http://schemas.microsoft.com/office/word/2010/wordprocessingDrawing" xmlns:wp="http://schemas.openxmlformats.org/drawingml/2006/wordprocessingDrawing" xmlns:w10="urn:schemas-microsoft-com:office:word" xmlns:w="http://schemas.openxmlformats.org/wordprocessingml/2006/main" xmlns:w14="http://schemas.microsoft.com/office/word/2010/wordml" xmlns:w15="http://schemas.microsoft.com/office/word/2012/wordml" xmlns:w16cex="http://schemas.microsoft.com/office/word/2018/wordml/cex" xmlns:w16cid="http://schemas.microsoft.com/office/word/2016/wordml/cid" xmlns:w16="http://schemas.microsoft.com/office/word/2018/wordml" xmlns:w16sdtdh="http://schemas.microsoft.com/office/word/2020/wordml/sdtdatahash" xmlns:w16se="http://schemas.microsoft.com/office/word/2015/wordml/symex" xmlns:wpg="http://schemas.microsoft.com/office/word/2010/wordprocessingGroup" xmlns:wpi="http://schemas.microsoft.com/office/word/2010/wordprocessingInk" xmlns:wne="http://schemas.microsoft.com/office/word/2006/wordml" xmlns:wps="http://schemas.microsoft.com/office/word/2010/wordprocessingShape" mc:Ignorable="w14 w15 w16se w16cid w16 w16cex w16sdtdh wp14">
+<w:hdr xmlns:wpc="http://schemas.microsoft.com/office/word/2010/wordprocessingCanvas" xmlns:cx="http://schemas.microsoft.com/office/drawing/2014/chartex" xmlns:cx1="http://schemas.microsoft.com/office/drawing/2015/9/8/chartex" xmlns:cx2="http://schemas.microsoft.com/office/drawing/2015/10/21/chartex" xmlns:cx3="http://schemas.microsoft.com/office/drawing/2016/5/9/chartex" xmlns:cx4="http://schemas.microsoft.com/office/drawing/2016/5/10/chartex" xmlns:cx5="http://schemas.microsoft.com/office/drawing/2016/5/11/chartex" xmlns:cx6="http://schemas.microsoft.com/office/drawing/2016/5/12/chartex" xmlns:cx7="http://schemas.microsoft.com/office/drawing/2016/5/13/chartex" xmlns:cx8="http://schemas.microsoft.com/office/drawing/2016/5/14/chartex" xmlns:mc="http://schemas.openxmlformats.org/markup-compatibility/2006" xmlns:aink="http://schemas.microsoft.com/office/drawing/2016/ink" xmlns:am3d="http://schemas.microsoft.com/office/drawing/2017/model3d" xmlns:o="urn:schemas-microsoft-com:office:office" xmlns:oel="http://schemas.microsoft.com/office/2019/extlst" xmlns:r="http://schemas.openxmlformats.org/officeDocument/2006/relationships" xmlns:m="http://schemas.openxmlformats.org/officeDocument/2006/math" xmlns:v="urn:schemas-microsoft-com:vml" xmlns:wp14="http://schemas.microsoft.com/office/word/2010/wordprocessingDrawing" xmlns:wp="http://schemas.openxmlformats.org/drawingml/2006/wordprocessingDrawing" xmlns:w10="urn:schemas-microsoft-com:office:word" xmlns:w="http://schemas.openxmlformats.org/wordprocessingml/2006/main" xmlns:w14="http://schemas.microsoft.com/office/word/2010/wordml" xmlns:w15="http://schemas.microsoft.com/office/word/2012/wordml" xmlns:w16cex="http://schemas.microsoft.com/office/word/2018/wordml/cex" xmlns:w16cid="http://schemas.microsoft.com/office/word/2016/wordml/cid" xmlns:w16="http://schemas.microsoft.com/office/word/2018/wordml" xmlns:w16du="http://schemas.microsoft.com/office/word/2023/wordml/word16du" xmlns:w16sdtdh="http://schemas.microsoft.com/office/word/2020/wordml/sdtdatahash" xmlns:w16sdtfl="http://schemas.microsoft.com/office/word/2024/wordml/sdtformatlock" xmlns:w16se="http://schemas.microsoft.com/office/word/2015/wordml/symex" xmlns:wpg="http://schemas.microsoft.com/office/word/2010/wordprocessingGroup" xmlns:wpi="http://schemas.microsoft.com/office/word/2010/wordprocessingInk" xmlns:wne="http://schemas.microsoft.com/office/word/2006/wordml" xmlns:wps="http://schemas.microsoft.com/office/word/2010/wordprocessingShape" mc:Ignorable="w14 w15 w16se w16cid w16 w16cex w16sdtdh w16sdtfl w16du wp14">
   <w:p>
     <w:pPr>
       <w:pStyle w:val="Encabezado"/>
@@ -1402,7 +1655,7 @@
 </file>
 
 <file path=word/numbering.xml><?xml version="1.0" encoding="utf-8"?>
-<w:numbering xmlns:wpc="http://schemas.microsoft.com/office/word/2010/wordprocessingCanvas" xmlns:cx="http://schemas.microsoft.com/office/drawing/2014/chartex" xmlns:cx1="http://schemas.microsoft.com/office/drawing/2015/9/8/chartex" xmlns:cx2="http://schemas.microsoft.com/office/drawing/2015/10/21/chartex" xmlns:cx3="http://schemas.microsoft.com/office/drawing/2016/5/9/chartex" xmlns:cx4="http://schemas.microsoft.com/office/drawing/2016/5/10/chartex" xmlns:cx5="http://schemas.microsoft.com/office/drawing/2016/5/11/chartex" xmlns:cx6="http://schemas.microsoft.com/office/drawing/2016/5/12/chartex" xmlns:cx7="http://schemas.microsoft.com/office/drawing/2016/5/13/chartex" xmlns:cx8="http://schemas.microsoft.com/office/drawing/2016/5/14/chartex" xmlns:mc="http://schemas.openxmlformats.org/markup-compatibility/2006" xmlns:aink="http://schemas.microsoft.com/office/drawing/2016/ink" xmlns:am3d="http://schemas.microsoft.com/office/drawing/2017/model3d" xmlns:o="urn:schemas-microsoft-com:office:office" xmlns:oel="http://schemas.microsoft.com/office/2019/extlst" xmlns:r="http://schemas.openxmlformats.org/officeDocument/2006/relationships" xmlns:m="http://schemas.openxmlformats.org/officeDocument/2006/math" xmlns:v="urn:schemas-microsoft-com:vml" xmlns:wp14="http://schemas.microsoft.com/office/word/2010/wordprocessingDrawing" xmlns:wp="http://schemas.openxmlformats.org/drawingml/2006/wordprocessingDrawing" xmlns:w10="urn:schemas-microsoft-com:office:word" xmlns:w="http://schemas.openxmlformats.org/wordprocessingml/2006/main" xmlns:w14="http://schemas.microsoft.com/office/word/2010/wordml" xmlns:w15="http://schemas.microsoft.com/office/word/2012/wordml" xmlns:w16cex="http://schemas.microsoft.com/office/word/2018/wordml/cex" xmlns:w16cid="http://schemas.microsoft.com/office/word/2016/wordml/cid" xmlns:w16="http://schemas.microsoft.com/office/word/2018/wordml" xmlns:w16sdtdh="http://schemas.microsoft.com/office/word/2020/wordml/sdtdatahash" xmlns:w16se="http://schemas.microsoft.com/office/word/2015/wordml/symex" xmlns:wpg="http://schemas.microsoft.com/office/word/2010/wordprocessingGroup" xmlns:wpi="http://schemas.microsoft.com/office/word/2010/wordprocessingInk" xmlns:wne="http://schemas.microsoft.com/office/word/2006/wordml" xmlns:wps="http://schemas.microsoft.com/office/word/2010/wordprocessingShape" mc:Ignorable="w14 w15 w16se w16cid w16 w16cex w16sdtdh wp14">
+<w:numbering xmlns:wpc="http://schemas.microsoft.com/office/word/2010/wordprocessingCanvas" xmlns:cx="http://schemas.microsoft.com/office/drawing/2014/chartex" xmlns:cx1="http://schemas.microsoft.com/office/drawing/2015/9/8/chartex" xmlns:cx2="http://schemas.microsoft.com/office/drawing/2015/10/21/chartex" xmlns:cx3="http://schemas.microsoft.com/office/drawing/2016/5/9/chartex" xmlns:cx4="http://schemas.microsoft.com/office/drawing/2016/5/10/chartex" xmlns:cx5="http://schemas.microsoft.com/office/drawing/2016/5/11/chartex" xmlns:cx6="http://schemas.microsoft.com/office/drawing/2016/5/12/chartex" xmlns:cx7="http://schemas.microsoft.com/office/drawing/2016/5/13/chartex" xmlns:cx8="http://schemas.microsoft.com/office/drawing/2016/5/14/chartex" xmlns:mc="http://schemas.openxmlformats.org/markup-compatibility/2006" xmlns:aink="http://schemas.microsoft.com/office/drawing/2016/ink" xmlns:am3d="http://schemas.microsoft.com/office/drawing/2017/model3d" xmlns:o="urn:schemas-microsoft-com:office:office" xmlns:oel="http://schemas.microsoft.com/office/2019/extlst" xmlns:r="http://schemas.openxmlformats.org/officeDocument/2006/relationships" xmlns:m="http://schemas.openxmlformats.org/officeDocument/2006/math" xmlns:v="urn:schemas-microsoft-com:vml" xmlns:wp14="http://schemas.microsoft.com/office/word/2010/wordprocessingDrawing" xmlns:wp="http://schemas.openxmlformats.org/drawingml/2006/wordprocessingDrawing" xmlns:w10="urn:schemas-microsoft-com:office:word" xmlns:w="http://schemas.openxmlformats.org/wordprocessingml/2006/main" xmlns:w14="http://schemas.microsoft.com/office/word/2010/wordml" xmlns:w15="http://schemas.microsoft.com/office/word/2012/wordml" xmlns:w16cex="http://schemas.microsoft.com/office/word/2018/wordml/cex" xmlns:w16cid="http://schemas.microsoft.com/office/word/2016/wordml/cid" xmlns:w16="http://schemas.microsoft.com/office/word/2018/wordml" xmlns:w16du="http://schemas.microsoft.com/office/word/2023/wordml/word16du" xmlns:w16sdtdh="http://schemas.microsoft.com/office/word/2020/wordml/sdtdatahash" xmlns:w16sdtfl="http://schemas.microsoft.com/office/word/2024/wordml/sdtformatlock" xmlns:w16se="http://schemas.microsoft.com/office/word/2015/wordml/symex" xmlns:wpg="http://schemas.microsoft.com/office/word/2010/wordprocessingGroup" xmlns:wpi="http://schemas.microsoft.com/office/word/2010/wordprocessingInk" xmlns:wne="http://schemas.microsoft.com/office/word/2006/wordml" xmlns:wps="http://schemas.microsoft.com/office/word/2010/wordprocessingShape" mc:Ignorable="w14 w15 w16se w16cid w16 w16cex w16sdtdh w16sdtfl w16du wp14">
   <w:abstractNum w:abstractNumId="0" w15:restartNumberingAfterBreak="0">
     <w:nsid w:val="49C604D3"/>
     <w:multiLevelType w:val="hybridMultilevel"/>
@@ -1759,7 +2012,7 @@
 </file>
 
 <file path=word/styles.xml><?xml version="1.0" encoding="utf-8"?>
-<w:styles xmlns:mc="http://schemas.openxmlformats.org/markup-compatibility/2006" xmlns:r="http://schemas.openxmlformats.org/officeDocument/2006/relationships" xmlns:w="http://schemas.openxmlformats.org/wordprocessingml/2006/main" xmlns:w14="http://schemas.microsoft.com/office/word/2010/wordml" xmlns:w15="http://schemas.microsoft.com/office/word/2012/wordml" xmlns:w16cex="http://schemas.microsoft.com/office/word/2018/wordml/cex" xmlns:w16cid="http://schemas.microsoft.com/office/word/2016/wordml/cid" xmlns:w16="http://schemas.microsoft.com/office/word/2018/wordml" xmlns:w16sdtdh="http://schemas.microsoft.com/office/word/2020/wordml/sdtdatahash" xmlns:w16se="http://schemas.microsoft.com/office/word/2015/wordml/symex" mc:Ignorable="w14 w15 w16se w16cid w16 w16cex w16sdtdh">
+<w:styles xmlns:mc="http://schemas.openxmlformats.org/markup-compatibility/2006" xmlns:r="http://schemas.openxmlformats.org/officeDocument/2006/relationships" xmlns:w="http://schemas.openxmlformats.org/wordprocessingml/2006/main" xmlns:w14="http://schemas.microsoft.com/office/word/2010/wordml" xmlns:w15="http://schemas.microsoft.com/office/word/2012/wordml" xmlns:w16cex="http://schemas.microsoft.com/office/word/2018/wordml/cex" xmlns:w16cid="http://schemas.microsoft.com/office/word/2016/wordml/cid" xmlns:w16="http://schemas.microsoft.com/office/word/2018/wordml" xmlns:w16du="http://schemas.microsoft.com/office/word/2023/wordml/word16du" xmlns:w16sdtdh="http://schemas.microsoft.com/office/word/2020/wordml/sdtdatahash" xmlns:w16sdtfl="http://schemas.microsoft.com/office/word/2024/wordml/sdtformatlock" xmlns:w16se="http://schemas.microsoft.com/office/word/2015/wordml/symex" mc:Ignorable="w14 w15 w16se w16cid w16 w16cex w16sdtdh w16sdtfl w16du">
   <w:docDefaults>
     <w:rPrDefault>
       <w:rPr>
@@ -2160,7 +2413,6 @@
   <w:style w:type="character" w:default="1" w:styleId="Fuentedeprrafopredeter">
     <w:name w:val="Default Paragraph Font"/>
     <w:uiPriority w:val="1"/>
-    <w:semiHidden/>
     <w:unhideWhenUsed/>
   </w:style>
   <w:style w:type="table" w:default="1" w:styleId="Tablanormal">

</xml_diff>